<commit_message>
fix(inscription-ecole-coranique): fiche PDF écrite de droite à gauche
Co-Authored-By: Claude Opus 5.5 <noreply@anthropic.com>
Claude-Session: https://claude.ai/code/session_01JbQszYj2L8Ny56Jwa95Awk
</commit_message>
<xml_diff>
--- a/inscription-ecole-coranique/modele-inscription.docx
+++ b/inscription-ecole-coranique/modele-inscription.docx
@@ -172,7 +172,6 @@
       <w:pPr>
         <w:bidi/>
         <w:spacing w:after="80" w:before="0"/>
-        <w:jc w:val="right"/>
       </w:pPr>
     </w:p>
     <w:tbl>
@@ -222,21 +221,18 @@
       <w:pPr>
         <w:bidi/>
         <w:spacing w:after="40" w:before="0"/>
-        <w:jc w:val="right"/>
       </w:pPr>
     </w:p>
     <w:p>
       <w:pPr>
         <w:bidi/>
         <w:spacing w:after="120" w:before="0"/>
-        <w:jc w:val="right"/>
       </w:pPr>
     </w:p>
     <w:p>
       <w:pPr>
         <w:bidi/>
         <w:spacing w:after="120" w:before="0"/>
-        <w:jc w:val="right"/>
       </w:pPr>
       <w:r>
         <w:rPr>
@@ -290,7 +286,6 @@
         <w:shd w:val="clear" w:color="auto" w:fill="BDD7EE"/>
         <w:bidi/>
         <w:spacing w:after="120" w:before="200"/>
-        <w:jc w:val="right"/>
       </w:pPr>
       <w:r>
         <w:rPr>
@@ -309,7 +304,6 @@
       <w:pPr>
         <w:bidi/>
         <w:spacing w:after="120" w:before="0"/>
-        <w:jc w:val="right"/>
       </w:pPr>
       <w:r>
         <w:rPr>
@@ -339,7 +333,6 @@
       <w:pPr>
         <w:bidi/>
         <w:spacing w:after="120" w:before="0"/>
-        <w:jc w:val="right"/>
       </w:pPr>
       <w:r>
         <w:rPr>
@@ -369,7 +362,6 @@
       <w:pPr>
         <w:bidi/>
         <w:spacing w:after="120" w:before="0"/>
-        <w:jc w:val="right"/>
       </w:pPr>
       <w:r>
         <w:rPr>
@@ -399,7 +391,6 @@
       <w:pPr>
         <w:bidi/>
         <w:spacing w:after="120" w:before="0"/>
-        <w:jc w:val="right"/>
       </w:pPr>
       <w:r>
         <w:rPr>
@@ -429,7 +420,6 @@
       <w:pPr>
         <w:bidi/>
         <w:spacing w:after="120" w:before="0"/>
-        <w:jc w:val="right"/>
       </w:pPr>
       <w:r>
         <w:rPr>
@@ -459,7 +449,6 @@
       <w:pPr>
         <w:bidi/>
         <w:spacing w:after="120" w:before="0"/>
-        <w:jc w:val="right"/>
       </w:pPr>
       <w:r>
         <w:rPr>
@@ -489,7 +478,6 @@
       <w:pPr>
         <w:bidi/>
         <w:spacing w:after="120" w:before="0"/>
-        <w:jc w:val="right"/>
       </w:pPr>
       <w:r>
         <w:rPr>
@@ -520,7 +508,6 @@
         <w:shd w:val="clear" w:color="auto" w:fill="A9D08E"/>
         <w:bidi/>
         <w:spacing w:after="120" w:before="200"/>
-        <w:jc w:val="right"/>
       </w:pPr>
       <w:r>
         <w:rPr>
@@ -539,7 +526,6 @@
       <w:pPr>
         <w:bidi/>
         <w:spacing w:after="120" w:before="0"/>
-        <w:jc w:val="right"/>
       </w:pPr>
       <w:r>
         <w:rPr>
@@ -569,7 +555,6 @@
       <w:pPr>
         <w:bidi/>
         <w:spacing w:after="120" w:before="0"/>
-        <w:jc w:val="right"/>
       </w:pPr>
       <w:r>
         <w:rPr>
@@ -599,7 +584,6 @@
       <w:pPr>
         <w:bidi/>
         <w:spacing w:after="120" w:before="0"/>
-        <w:jc w:val="right"/>
       </w:pPr>
       <w:r>
         <w:rPr>
@@ -653,7 +637,6 @@
         <w:shd w:val="clear" w:color="auto" w:fill="808080"/>
         <w:bidi/>
         <w:spacing w:after="120" w:before="200"/>
-        <w:jc w:val="right"/>
       </w:pPr>
       <w:r>
         <w:rPr>
@@ -690,7 +673,6 @@
       <w:pPr>
         <w:bidi/>
         <w:spacing w:after="120" w:before="0"/>
-        <w:jc w:val="right"/>
       </w:pPr>
       <w:r>
         <w:rPr>
@@ -720,7 +702,6 @@
       <w:pPr>
         <w:bidi/>
         <w:spacing w:after="200" w:before="0"/>
-        <w:jc w:val="right"/>
       </w:pPr>
     </w:p>
     <w:p>

</xml_diff>